<commit_message>
Renato Aragão: revisão parte 2
Co-Authored-By: Claude Opus 5.5 <noreply@anthropic.com>
Claude-Session: https://claude.ai/code/session_01MJjUEEZrxQDEUifKK2vj9g
</commit_message>
<xml_diff>
--- a/roteiros/renato-aragao/RenatoAragao_Parte2.docx
+++ b/roteiros/renato-aragao/RenatoAragao_Parte2.docx
@@ -63,7 +63,7 @@
         <w:rPr>
           <w:color w:val="000000"/>
         </w:rPr>
-        <w:t>Para o público, era só um detalhe gráfico. Para os outros três Trapalhões, era a prova de algo que eles sentiam havia anos.</w:t>
+        <w:t>Para o público, era só um detalhe gráfico. Para os outros três Trapalhões, dizia muito sobre quem mandava no grupo.</w:t>
       </w:r>
     </w:p>
     <w:p>
@@ -151,7 +151,7 @@
         <w:rPr>
           <w:color w:val="000000"/>
         </w:rPr>
-        <w:t>No filme "Cinderelo Trapalhão", a divisão foi de setenta e cinco por cento para Renato e vinte e cinco para a empresa que os outros três tinham criado.</w:t>
+        <w:t>No filme "Cinderelo Trapalhão", a divisão foi de setenta e cinco por cento para Renato e vinte e cinco para a empresa que os outros três tinham criado juntos.</w:t>
       </w:r>
     </w:p>
     <w:p>
@@ -167,7 +167,7 @@
         <w:rPr>
           <w:color w:val="000000"/>
         </w:rPr>
-        <w:t>Os quatro apareciam juntos em cada cena. Faziam o país rir juntos. Mas, na hora de dividir o que as pessoas pagavam nas bilheterias, um deles ficava com quase tudo.</w:t>
+        <w:t>Os quatro dividiam as cenas. Faziam o país rir juntos. Mas, na hora de dividir o que as pessoas pagavam nas bilheterias, um deles ficava com quase tudo.</w:t>
       </w:r>
     </w:p>
     <w:p>
@@ -175,7 +175,7 @@
         <w:rPr>
           <w:color w:val="C00000"/>
         </w:rPr>
-        <w:t>Imagine por um momento ser um desses três. Passar anos levando tombo, apanhando em cena, lotando cinemas pelo Brasil. E descobrir que a sua parte do filme cabe na palma da mão. Em agosto de mil novecentos e oitenta e três, eles decidiram que não iam mais aceitar.</w:t>
+        <w:t>Imagine por um momento ser um desses três. Passar anos levando tombo em cena e lotando cinemas pelo Brasil. E descobrir que a sua parte do filme cabe na palma da mão. Em agosto de mil novecentos e oitenta e três, eles decidiram que não iam mais aceitar.</w:t>
       </w:r>
     </w:p>
     <w:p>
@@ -231,7 +231,7 @@
         <w:rPr>
           <w:color w:val="000000"/>
         </w:rPr>
-        <w:t>A Globo tentou segurar a crise como pôde. Durante os meses seguintes, reprisou filmes do grupo, enquanto os quatro não se entendiam.</w:t>
+        <w:t>Durante os meses seguintes, a Globo reprisou filmes do grupo, enquanto os quatro não se entendiam.</w:t>
       </w:r>
     </w:p>
     <w:p>
@@ -263,15 +263,7 @@
         <w:rPr>
           <w:color w:val="000000"/>
         </w:rPr>
-        <w:t>Os meses seguintes viraram uma guerra de bilheterias.</w:t>
-      </w:r>
-    </w:p>
-    <w:p>
-      <w:r>
-        <w:rPr>
-          <w:color w:val="000000"/>
-        </w:rPr>
-        <w:t>Em mil novecentos e oitenta e quatro, dois filmes chegaram aos cinemas, quase ao mesmo tempo.</w:t>
+        <w:t>A separação virou uma guerra de bilheterias. Cada lado fez o próprio filme.</w:t>
       </w:r>
     </w:p>
     <w:p>
@@ -295,7 +287,7 @@
         <w:rPr>
           <w:color w:val="000000"/>
         </w:rPr>
-        <w:t>Até que, em fevereiro de mil novecentos e oitenta e quatro, seis meses depois da coletiva, os quatro se sentaram para almoçar no Rio de Janeiro.</w:t>
+        <w:t>Em fevereiro de mil novecentos e oitenta e quatro, seis meses depois da coletiva, os quatro se sentaram para almoçar no Rio de Janeiro.</w:t>
       </w:r>
     </w:p>
     <w:p>
@@ -311,7 +303,7 @@
         <w:rPr>
           <w:color w:val="000000"/>
         </w:rPr>
-        <w:t>Anos depois, Zacarias resumiria aquela separação numa frase: "Foi tudo um pesadelo para mim, um parêntese, não aconteceu."</w:t>
+        <w:t>Zacarias resumiria aquela separação numa frase: "Foi tudo um pesadelo para mim, um parêntese, não aconteceu."</w:t>
       </w:r>
     </w:p>
     <w:p>
@@ -328,14 +320,6 @@
           <w:color w:val="000000"/>
         </w:rPr>
         <w:t>Os Trapalhões voltaram.</w:t>
-      </w:r>
-    </w:p>
-    <w:p>
-      <w:r>
-        <w:rPr>
-          <w:color w:val="000000"/>
-        </w:rPr>
-        <w:t>O Brasil comemorou.</w:t>
       </w:r>
     </w:p>
     <w:p>
@@ -415,7 +399,7 @@
         <w:rPr>
           <w:color w:val="000000"/>
         </w:rPr>
-        <w:t>Muitos anos depois, Dedé Santana diria que a relação com Renato continuou boa. Segundo o portal de Leo Dias, o próprio Renato chegou a pagar o plano de saúde do antigo parceiro.</w:t>
+        <w:t>Segundo o portal de Leo Dias, Dedé manteve uma boa relação com Renato ao longo dos anos. O próprio Renato chegou a pagar o plano de saúde do antigo parceiro.</w:t>
       </w:r>
     </w:p>
     <w:p>
@@ -431,7 +415,7 @@
         <w:rPr>
           <w:color w:val="C00000"/>
         </w:rPr>
-        <w:t>Só que a fama do Didi, a fortuna que ele construiu com aqueles contratos e o título de maior palhaço do Brasil escondiam outra história. Uma história que não envolvia os parceiros de palco. Envolvia a própria família dele. E ela só veio a público quando o Didi já tinha noventa anos.</w:t>
+        <w:t>Só que a fama do Didi e a fortuna que ele construiu com aqueles contratos escondiam outra história. Uma história que não envolvia os parceiros de palco. Envolvia a própria família dele. E ela só veio a público quando o Didi já tinha noventa anos.</w:t>
       </w:r>
     </w:p>
     <w:sectPr>

</xml_diff>